<commit_message>
[Doc] Cap nhat bao cao MongoDB chi tiet trong NoSQL_DoAn.docx va NoSQL_MongoDB_PhanCong.pdf
</commit_message>
<xml_diff>
--- a/TaiLieu/NoSQL_DoAn.docx
+++ b/TaiLieu/NoSQL_DoAn.docx
@@ -2585,6 +2585,121 @@
           <w:szCs w:val="26"/>
         </w:rPr>
       </w:pPr>
+    </w:p>
+    <w:p>
+      <w:r>
+        <w:br w:type="page"/>
+      </w:r>
+    </w:p>
+    <w:p>
+      <w:pPr>
+        <w:pStyle w:val="Heading1"/>
+      </w:pPr>
+      <w:r>
+        <w:t>PHẦN 4: THIẾT KẾ &amp; THỰC THI CƠ SỞ DỮ LIỆU MONGODB</w:t>
+      </w:r>
+    </w:p>
+    <w:p>
+      <w:r>
+        <w:t>Hệ thống sử dụng MongoDB làm Document Database lưu trữ các dữ liệu phi cấu trúc, không phụ thuộc vào Schema cố định bao gồm Đánh giá phim (Movie Reviews) và Phản hồi khách hàng (Customer Feedbacks).</w:t>
+      </w:r>
+    </w:p>
+    <w:p>
+      <w:pPr>
+        <w:pStyle w:val="Heading2"/>
+      </w:pPr>
+      <w:r>
+        <w:t>4.1. Kiến trúc &amp; Cấu hình Kết nối</w:t>
+      </w:r>
+    </w:p>
+    <w:p>
+      <w:r>
+        <w:t>- Database Name: CinemaNoSQL</w:t>
+      </w:r>
+    </w:p>
+    <w:p>
+      <w:r>
+        <w:t>- Host/Port: localhost:27017 (Container: docker_mongodb)</w:t>
+      </w:r>
+    </w:p>
+    <w:p>
+      <w:r>
+        <w:t>- Library C# Driver: MongoDB.Driver 2.8.1 / .NET Framework 4.5.2</w:t>
+      </w:r>
+    </w:p>
+    <w:p>
+      <w:pPr>
+        <w:pStyle w:val="Heading2"/>
+      </w:pPr>
+      <w:r>
+        <w:t>4.2. Danh sách Collections &amp; Cấu trúc Document (BSON Schema)</w:t>
+      </w:r>
+    </w:p>
+    <w:p>
+      <w:r>
+        <w:t>1. Collection movie_reviews: Lưu trữ nhận xét, số sao đánh giá (rating 1-5), lượt thích (likesCount), tags và trạng thái duyệt (status).</w:t>
+      </w:r>
+    </w:p>
+    <w:p>
+      <w:r>
+        <w:t>2. Collection customer_feedbacks: Lưu trữ ticket khiếu nại, phản hồi hỗ trợ kỹ thuật và mảng lồng (Embedded Array) conversations ghi vết trao đổi giữa khách hàng và Admin.</w:t>
+      </w:r>
+    </w:p>
+    <w:p>
+      <w:pPr>
+        <w:pStyle w:val="Heading2"/>
+      </w:pPr>
+      <w:r>
+        <w:t>4.3. Các Thao tác Lập trình &amp; CSDL (CRUD &amp; Aggregation Pipeline)</w:t>
+      </w:r>
+    </w:p>
+    <w:p>
+      <w:r>
+        <w:t>- Create (InsertOneAsync): Thêm bài đánh giá phim mới và Tạo ticket phản hồi khiếu nại mới.</w:t>
+      </w:r>
+    </w:p>
+    <w:p>
+      <w:r>
+        <w:t>- Read (Find &amp; Sort): Lọc danh sách review theo movieId và status=Approved; Lọc ticket theo username.</w:t>
+      </w:r>
+    </w:p>
+    <w:p>
+      <w:r>
+        <w:t>- Update (UpdateOne &amp; /): Tăng lượt thích bài viết () và Thêm câu trả lời Admin vào mảng conversations () đồng thời cập nhật status=Resolved ().</w:t>
+      </w:r>
+    </w:p>
+    <w:p>
+      <w:r>
+        <w:t>- Aggregation Pipeline 1 ( &amp; ): Thống kê điểm đánh giá trung bình và tổng số nhận xét của từng bộ phim.</w:t>
+      </w:r>
+    </w:p>
+    <w:p>
+      <w:r>
+        <w:t>- Aggregation Pipeline 2 ( &amp; ): Thống kê số lượng ticket hỗ trợ phân loại theo từng chuyên mục.</w:t>
+      </w:r>
+    </w:p>
+    <w:p>
+      <w:pPr>
+        <w:pStyle w:val="Heading2"/>
+      </w:pPr>
+      <w:r>
+        <w:t>4.4. Tích hợp Giao diện Web ASP.NET MVC</w:t>
+      </w:r>
+    </w:p>
+    <w:p>
+      <w:r>
+        <w:t>- Trang Đánh giá Phim: http://localhost:57216/MgdbMovieReview/Index (Controller: MgdbMovieReviewController)</w:t>
+      </w:r>
+    </w:p>
+    <w:p>
+      <w:r>
+        <w:t>- Trang Hỗ trợ Khách hàng: http://localhost:57216/MgdbCustomerFeedback/Index (Controller: MgdbCustomerFeedbackController)</w:t>
+      </w:r>
+    </w:p>
+    <w:p>
+      <w:r>
+        <w:t>- Đã tích hợp 2 nút truy cập nhanh màu xanh lá lên thanh Menu Header chính của trang web.</w:t>
+      </w:r>
     </w:p>
     <w:sectPr>
       <w:pgSz w:w="12240" w:h="15840"/>

</xml_diff>